<commit_message>
dev log for sprint 1 done
</commit_message>
<xml_diff>
--- a/L2 Web Application Development Log.docx
+++ b/L2 Web Application Development Log.docx
@@ -574,6 +574,9 @@
               <w:spacing w:line="240" w:lineRule="auto"/>
             </w:pPr>
             <w:r>
+              <w:rPr>
+                <w:noProof/>
+              </w:rPr>
               <w:drawing>
                 <wp:anchor distT="0" distB="0" distL="114300" distR="114300" simplePos="0" relativeHeight="251660288" behindDoc="0" locked="0" layoutInCell="1" allowOverlap="1" wp14:anchorId="44FD6722" wp14:editId="2848C2BB">
                   <wp:simplePos x="0" y="0"/>
@@ -2138,6 +2141,13 @@
               </w:pBdr>
               <w:spacing w:line="240" w:lineRule="auto"/>
             </w:pPr>
+            <w:r>
+              <w:t xml:space="preserve">This Sprint did not quite go as expected I was hoping to get a lot further than I did although I managed to </w:t>
+            </w:r>
+            <w:r>
+              <w:lastRenderedPageBreak/>
+              <w:t>get the index page well designed and put together with the HTML and the CSS styling I was hoping to have more of the functionality with the database completed I managed to get dynamic routing completed with the dummy data in the database pulled through but I’m yet to have the forms completed so that a user is able to sign up and add a profile successfully each of the bio pages are just empty at the moment and that needs to be fixed Also I haven’t styled the footer.</w:t>
+            </w:r>
           </w:p>
           <w:p>
             <w:pPr>
@@ -9566,7 +9576,7 @@
           <v:path o:extrusionok="f" gradientshapeok="t" o:connecttype="rect"/>
           <o:lock v:ext="edit" aspectratio="t"/>
         </v:shapetype>
-        <v:shape id="WordPictureWatermark2" o:spid="_x0000_s1026" type="#_x0000_t75" alt="" style="position:absolute;margin-left:841.8pt;margin-top:0;width:261.65pt;height:263.4pt;z-index:-251657728;mso-position-horizontal:right;mso-position-horizontal-relative:margin;mso-position-vertical:bottom;mso-position-vertical-relative:margin">
+        <v:shape id="WordPictureWatermark2" o:spid="_x0000_s1026" type="#_x0000_t75" alt="" style="position:absolute;margin-left:1052.25pt;margin-top:0;width:261.65pt;height:263.4pt;z-index:-251657728;mso-position-horizontal:right;mso-position-horizontal-relative:margin;mso-position-vertical:bottom;mso-position-vertical-relative:margin">
           <v:imagedata r:id="rId1" o:title="image3" gain="19661f" blacklevel="22938f"/>
           <w10:wrap anchorx="margin" anchory="margin"/>
         </v:shape>

</xml_diff>